<commit_message>
Rename Pod/Pod Ultra to Chamber/Chamber Ultra across all files; add Kingsley Miller pitch doc
</commit_message>
<xml_diff>
--- a/templates/AXRAH-Football-Club-Outreach.docx
+++ b/templates/AXRAH-Football-Club-Outreach.docx
@@ -41,7 +41,7 @@
           <w:color w:val="555555"/>
           <w:sz w:val="19"/>
         </w:rPr>
-        <w:t>Lead product: AXRAH Pod Ultra ($24,999) or Pod ($14,999)</w:t>
+        <w:t>Lead product: AXRAH Chamber Ultra ($24,999) or Chamber ($14,999)</w:t>
       </w:r>
     </w:p>
     <w:p>
@@ -55,7 +55,7 @@
           <w:color w:val="555555"/>
           <w:sz w:val="19"/>
         </w:rPr>
-        <w:t>Target contacts: Head of Sports Science · Performance Director · Club Medical Officer · Academy Director · CEO/CFO</w:t>
+        <w:t>Target: Head of Sports Science · Performance Director · Club Medical Officer · Academy Director · CEO/CFO</w:t>
       </w:r>
     </w:p>
     <w:p>
@@ -265,7 +265,7 @@
           <w:color w:val="1A1A1A"/>
           <w:sz w:val="21"/>
         </w:rPr>
-        <w:t>The AXRAH Pod Ultra — 43,200 LEDs, 5 wavelengths, 6,000W output, 129 mW/cm² irradiance — sits next to the NovoTHOR on clinical specs at roughly 1/5 the price. We supply clinics, medical centres, and performance facilities across the US and Europe.</w:t>
+        <w:t>The AXRAH Chamber Ultra — 43,200 LEDs, 5 wavelengths, 6,000W output, 129 mW/cm² irradiance — sits next to the NovoTHOR on clinical specs at roughly 1/5 the price. We supply clinics, medical centres, and performance facilities across the US and Europe.</w:t>
       </w:r>
     </w:p>
     <w:p>
@@ -687,7 +687,7 @@
           <w:color w:val="CC0000"/>
           <w:sz w:val="21"/>
         </w:rPr>
-        <w:t>Last note — AXRAH Pod Ultra</w:t>
+        <w:t>Last note — AXRAH Chamber Ultra</w:t>
       </w:r>
     </w:p>
     <w:p>
@@ -907,7 +907,7 @@
           <w:color w:val="999999"/>
           <w:sz w:val="18"/>
         </w:rPr>
-        <w:t>Warmer tone, lead with the price disruption angle  ·  Day 0</w:t>
+        <w:t>Warmer tone  ·  Day 0</w:t>
       </w:r>
     </w:p>
     <w:p>
@@ -922,7 +922,7 @@
           <w:color w:val="1A1A1A"/>
           <w:sz w:val="21"/>
         </w:rPr>
-        <w:t>Hi [First Name] — I work with sports performance facilities on full-body photobiomodulation. Clubs are using it to cut soft tissue recovery time significantly, and the tech has come a long way on pricing — full-body pods now available at under £20K vs £80K+ for the legacy brands.</w:t>
+        <w:t>Hi [First Name] — I work with sports performance facilities on full-body photobiomodulation. Clubs are using it to cut soft tissue recovery time significantly, and the tech has come a long way on pricing — full-body chambers now available at under £20K vs £80K+ for the legacy brands.</w:t>
       </w:r>
     </w:p>
     <w:p>
@@ -1315,7 +1315,7 @@
           <w:color w:val="555555"/>
           <w:sz w:val="21"/>
         </w:rPr>
-        <w:t>NovoTHOR is a solid system, but it's approximately $130,000 USD, runs two wavelengths, and outputs around 17 mW/cm². Our Pod Ultra runs five wavelengths at 129 mW/cm² and is priced under $25,000. The clinical output is comparable to anything on the market; the price isn't.</w:t>
+        <w:t>NovoTHOR is a solid system, but it's approximately $130,000 USD, runs two wavelengths, and outputs around 17 mW/cm². Our Chamber Ultra runs five wavelengths at 129 mW/cm² and is priced under $25,000. The clinical output is comparable to anything on the market; the price isn't.</w:t>
       </w:r>
     </w:p>
     <w:p>
@@ -1503,7 +1503,7 @@
           <w:color w:val="1A1A1A"/>
           <w:sz w:val="21"/>
         </w:rPr>
-        <w:t>Log: Date / channel / contact name &amp; role / key objection raised / agreed next step / follow-up date</w:t>
+        <w:t>Log: Date / channel / contact / role / objection raised / next step / follow-up date</w:t>
       </w:r>
     </w:p>
     <w:sectPr>

</xml_diff>